<commit_message>
Documenta el boton Limpiar y la descarga del directorio en PDF
El manual ciudadano no mencionaba dos funciones del sitio publico que
se agregaron esta sesion:

- El boton "X" que aparece junto al cuadro de busqueda para borrar el
  texto de un toque (se agrega como oracion final del parrafo del
  Paso 1, que ya explica ese mismo cuadro).
- El enlace "Descargar directorio (PDF)" del pie de la pagina
  principal, incluyendo que si se llega desde el QR de una sede el
  PDF trae solo esa sede (se agrega como parrafo nuevo, entre los
  bullets de "que te muestra cada resultado" y el Consejo existente).

Co-Authored-By: Claude Sonnet 5 <noreply@anthropic.com>
</commit_message>
<xml_diff>
--- a/JusticiaOrienta_07_Manual_Ciudadano.docx
+++ b/JusticiaOrienta_07_Manual_Ciudadano.docx
@@ -322,7 +322,7 @@
           <w:color w:val="222222"/>
           <w:sz w:val="24"/>
         </w:rPr>
-        <w:t>En el cuadro "¿Qué necesitas?" escribe con tus propias palabras. No hace falta el nombre exacto: "once civil" encuentra el mismo resultado que "11° Juzgado Civil", y "rrhh" encuentra "Recursos Humanos".</w:t>
+        <w:t>En el cuadro "¿Qué necesitas?" escribe con tus propias palabras. No hace falta el nombre exacto: "once civil" encuentra el mismo resultado que "11° Juzgado Civil", y "rrhh" encuentra "Recursos Humanos". Mientras hay texto escrito aparece un botón "✕" para borrarlo de un solo toque y empezar de nuevo.</w:t>
       </w:r>
     </w:p>
     <w:p>
@@ -448,6 +448,20 @@
           <w:sz w:val="24"/>
         </w:rPr>
         <w:t>•  Un enlace "Cómo llegar" que abre la dirección en un mapa (OpenStreetMap).</w:t>
+      </w:r>
+    </w:p>
+    <w:p>
+      <w:pPr>
+        <w:spacing w:after="80"/>
+        <w:ind w:left="340"/>
+      </w:pPr>
+      <w:r>
+        <w:rPr>
+          <w:rFonts w:ascii="Calibri" w:hAnsi="Calibri"/>
+          <w:color w:val="222222"/>
+          <w:sz w:val="24"/>
+        </w:rPr>
+        <w:t>Si prefieres tener todo el directorio a la mano en vez de buscar uno por uno, al final de la página principal hay un enlace "Descargar directorio (PDF)" con todas las oficinas activas. Si llegaste escaneando el código QR de una sede, ese enlace descarga solo el directorio de esa sede.</w:t>
       </w:r>
     </w:p>
     <w:p>

</xml_diff>